<commit_message>
sprint backlog - new doc title
</commit_message>
<xml_diff>
--- a/RPI/lab3/Backlog_sprintu.docx
+++ b/RPI/lab3/Backlog_sprintu.docx
@@ -64,7 +64,7 @@
         <w:rPr>
           <w:rtl w:val="0"/>
         </w:rPr>
-        <w:t xml:space="preserve">Scrum: Backlog produktu</w:t>
+        <w:t xml:space="preserve">Scrum: Backlog sprintu</w:t>
       </w:r>
       <w:r>
         <w:rPr>
@@ -347,12 +347,12 @@
           <wp:inline distB="114300" distT="114300" distL="114300" distR="114300">
             <wp:extent cx="5731200" cy="3175000"/>
             <wp:effectExtent b="0" l="0" r="0" t="0"/>
-            <wp:docPr id="5" name="image5.png"/>
+            <wp:docPr id="5" name="image3.png"/>
             <a:graphic>
               <a:graphicData uri="http://schemas.openxmlformats.org/drawingml/2006/picture">
                 <pic:pic>
                   <pic:nvPicPr>
-                    <pic:cNvPr id="0" name="image5.png"/>
+                    <pic:cNvPr id="0" name="image3.png"/>
                     <pic:cNvPicPr preferRelativeResize="0"/>
                   </pic:nvPicPr>
                   <pic:blipFill>
@@ -1753,12 +1753,12 @@
           <wp:inline distB="114300" distT="114300" distL="114300" distR="114300">
             <wp:extent cx="5731200" cy="2870200"/>
             <wp:effectExtent b="0" l="0" r="0" t="0"/>
-            <wp:docPr id="2" name="image1.png"/>
+            <wp:docPr id="2" name="image5.png"/>
             <a:graphic>
               <a:graphicData uri="http://schemas.openxmlformats.org/drawingml/2006/picture">
                 <pic:pic>
                   <pic:nvPicPr>
-                    <pic:cNvPr id="0" name="image1.png"/>
+                    <pic:cNvPr id="0" name="image5.png"/>
                     <pic:cNvPicPr preferRelativeResize="0"/>
                   </pic:nvPicPr>
                   <pic:blipFill>
@@ -1823,12 +1823,12 @@
           <wp:inline distB="114300" distT="114300" distL="114300" distR="114300">
             <wp:extent cx="5731200" cy="6121400"/>
             <wp:effectExtent b="0" l="0" r="0" t="0"/>
-            <wp:docPr id="1" name="image2.png"/>
+            <wp:docPr id="1" name="image1.png"/>
             <a:graphic>
               <a:graphicData uri="http://schemas.openxmlformats.org/drawingml/2006/picture">
                 <pic:pic>
                   <pic:nvPicPr>
-                    <pic:cNvPr id="0" name="image2.png"/>
+                    <pic:cNvPr id="0" name="image1.png"/>
                     <pic:cNvPicPr preferRelativeResize="0"/>
                   </pic:nvPicPr>
                   <pic:blipFill>
@@ -1879,12 +1879,12 @@
           <wp:inline distB="114300" distT="114300" distL="114300" distR="114300">
             <wp:extent cx="5731200" cy="6832600"/>
             <wp:effectExtent b="0" l="0" r="0" t="0"/>
-            <wp:docPr id="4" name="image3.png"/>
+            <wp:docPr id="4" name="image4.png"/>
             <a:graphic>
               <a:graphicData uri="http://schemas.openxmlformats.org/drawingml/2006/picture">
                 <pic:pic>
                   <pic:nvPicPr>
-                    <pic:cNvPr id="0" name="image3.png"/>
+                    <pic:cNvPr id="0" name="image4.png"/>
                     <pic:cNvPicPr preferRelativeResize="0"/>
                   </pic:nvPicPr>
                   <pic:blipFill>
@@ -1924,12 +1924,12 @@
           <wp:inline distB="114300" distT="114300" distL="114300" distR="114300">
             <wp:extent cx="5731200" cy="6223000"/>
             <wp:effectExtent b="0" l="0" r="0" t="0"/>
-            <wp:docPr id="3" name="image4.png"/>
+            <wp:docPr id="3" name="image2.png"/>
             <a:graphic>
               <a:graphicData uri="http://schemas.openxmlformats.org/drawingml/2006/picture">
                 <pic:pic>
                   <pic:nvPicPr>
-                    <pic:cNvPr id="0" name="image4.png"/>
+                    <pic:cNvPr id="0" name="image2.png"/>
                     <pic:cNvPicPr preferRelativeResize="0"/>
                   </pic:nvPicPr>
                   <pic:blipFill>

</xml_diff>